<commit_message>
dbms 4th sem topic updated
</commit_message>
<xml_diff>
--- a/public/assets/more/CSE/RTU Imp topic for 4th Semester.docx
+++ b/public/assets/more/CSE/RTU Imp topic for 4th Semester.docx
@@ -1409,6 +1409,553 @@
           <w:lang w:val="en-US"/>
         </w:rPr>
       </w:pPr>
+    </w:p>
+    <w:p>
+      <w:pPr>
+        <w:rPr>
+          <w:rFonts w:hint="default" w:ascii="Consolas" w:hAnsi="Consolas" w:eastAsia="Consolas"/>
+          <w:b/>
+          <w:bCs w:val="0"/>
+          <w:color w:val="000000"/>
+          <w:sz w:val="22"/>
+          <w:szCs w:val="24"/>
+          <w:lang w:val="en-US"/>
+        </w:rPr>
+      </w:pPr>
+      <w:r>
+        <w:rPr>
+          <w:rFonts w:hint="default" w:ascii="Consolas" w:hAnsi="Consolas" w:eastAsia="Consolas"/>
+          <w:b/>
+          <w:bCs w:val="0"/>
+          <w:color w:val="000000"/>
+          <w:sz w:val="22"/>
+          <w:szCs w:val="24"/>
+          <w:lang w:val="en-US"/>
+        </w:rPr>
+        <w:t xml:space="preserve">Unit 2 Addresing mode, Instructions based on size, Timing diagram </w:t>
+      </w:r>
+    </w:p>
+    <w:p>
+      <w:pPr>
+        <w:rPr>
+          <w:rFonts w:hint="default" w:ascii="Consolas" w:hAnsi="Consolas" w:eastAsia="Consolas"/>
+          <w:b w:val="0"/>
+          <w:bCs/>
+          <w:color w:val="000000"/>
+          <w:sz w:val="22"/>
+          <w:szCs w:val="24"/>
+          <w:lang w:val="en-US"/>
+        </w:rPr>
+      </w:pPr>
+      <w:r>
+        <w:rPr>
+          <w:rFonts w:hint="default" w:ascii="Consolas" w:hAnsi="Consolas" w:eastAsia="Consolas"/>
+          <w:b w:val="0"/>
+          <w:bCs/>
+          <w:color w:val="000000"/>
+          <w:sz w:val="22"/>
+          <w:szCs w:val="24"/>
+          <w:lang w:val="en-US"/>
+        </w:rPr>
+        <w:t>Machine cycle and instruction cycle, time delay</w:t>
+      </w:r>
+    </w:p>
+    <w:p>
+      <w:pPr>
+        <w:rPr>
+          <w:rFonts w:hint="default" w:ascii="Consolas" w:hAnsi="Consolas" w:eastAsia="Consolas"/>
+          <w:b w:val="0"/>
+          <w:bCs/>
+          <w:color w:val="000000"/>
+          <w:sz w:val="22"/>
+          <w:szCs w:val="24"/>
+          <w:lang w:val="en-US"/>
+        </w:rPr>
+      </w:pPr>
+      <w:r>
+        <w:rPr>
+          <w:rFonts w:hint="default" w:ascii="Consolas" w:hAnsi="Consolas" w:eastAsia="Consolas"/>
+          <w:b w:val="0"/>
+          <w:bCs/>
+          <w:color w:val="000000"/>
+          <w:sz w:val="22"/>
+          <w:szCs w:val="24"/>
+          <w:lang w:val="en-US"/>
+        </w:rPr>
+        <w:t>Imp instructions: STA , LDA , LDX, LXI, MOV, MVI, LHLD, ADI, DAD, JMP, CALL</w:t>
+      </w:r>
+    </w:p>
+    <w:p>
+      <w:pPr>
+        <w:rPr>
+          <w:rFonts w:hint="default" w:ascii="Consolas" w:hAnsi="Consolas" w:eastAsia="Consolas"/>
+          <w:b w:val="0"/>
+          <w:bCs/>
+          <w:color w:val="000000"/>
+          <w:sz w:val="22"/>
+          <w:szCs w:val="24"/>
+          <w:lang w:val="en-US"/>
+        </w:rPr>
+      </w:pPr>
+    </w:p>
+    <w:p>
+      <w:pPr>
+        <w:rPr>
+          <w:rFonts w:hint="default" w:ascii="Consolas" w:hAnsi="Consolas" w:eastAsia="Consolas"/>
+          <w:b/>
+          <w:bCs w:val="0"/>
+          <w:color w:val="000000"/>
+          <w:sz w:val="22"/>
+          <w:szCs w:val="24"/>
+          <w:lang w:val="en-US"/>
+        </w:rPr>
+      </w:pPr>
+      <w:r>
+        <w:rPr>
+          <w:rFonts w:hint="default" w:ascii="Consolas" w:hAnsi="Consolas" w:eastAsia="Consolas"/>
+          <w:b/>
+          <w:bCs w:val="0"/>
+          <w:color w:val="000000"/>
+          <w:sz w:val="22"/>
+          <w:szCs w:val="24"/>
+          <w:lang w:val="en-US"/>
+        </w:rPr>
+        <w:t xml:space="preserve">Unit 3 Imp programs </w:t>
+      </w:r>
+      <w:r>
+        <w:rPr>
+          <w:rFonts w:hint="default" w:ascii="Consolas" w:hAnsi="Consolas" w:eastAsia="Consolas"/>
+          <w:b/>
+          <w:bCs w:val="0"/>
+          <w:color w:val="000000"/>
+          <w:sz w:val="22"/>
+          <w:szCs w:val="24"/>
+          <w:lang w:val="en-US"/>
+        </w:rPr>
+        <w:br w:type="textWrapping"/>
+      </w:r>
+      <w:r>
+        <w:rPr>
+          <w:rFonts w:hint="default" w:ascii="Consolas" w:hAnsi="Consolas" w:eastAsia="Consolas"/>
+          <w:b/>
+          <w:bCs w:val="0"/>
+          <w:color w:val="000000"/>
+          <w:sz w:val="22"/>
+          <w:szCs w:val="24"/>
+          <w:lang w:val="en-US"/>
+        </w:rPr>
+        <w:tab/>
+      </w:r>
+      <w:r>
+        <w:rPr>
+          <w:rFonts w:hint="default" w:ascii="Consolas" w:hAnsi="Consolas" w:eastAsia="Consolas"/>
+          <w:b/>
+          <w:bCs w:val="0"/>
+          <w:color w:val="000000"/>
+          <w:sz w:val="22"/>
+          <w:szCs w:val="24"/>
+          <w:lang w:val="en-US"/>
+        </w:rPr>
+        <w:t>a) Addition of two number 8 bit data and store at 16 bit address</w:t>
+      </w:r>
+    </w:p>
+    <w:p>
+      <w:pPr>
+        <w:ind w:firstLine="720" w:firstLineChars="0"/>
+        <w:rPr>
+          <w:rFonts w:hint="default" w:ascii="Consolas" w:hAnsi="Consolas" w:eastAsia="Consolas"/>
+          <w:b/>
+          <w:bCs w:val="0"/>
+          <w:color w:val="000000"/>
+          <w:sz w:val="22"/>
+          <w:szCs w:val="24"/>
+          <w:lang w:val="en-US"/>
+        </w:rPr>
+      </w:pPr>
+      <w:r>
+        <w:rPr>
+          <w:rFonts w:hint="default" w:ascii="Consolas" w:hAnsi="Consolas" w:eastAsia="Consolas"/>
+          <w:b/>
+          <w:bCs w:val="0"/>
+          <w:color w:val="000000"/>
+          <w:sz w:val="22"/>
+          <w:szCs w:val="24"/>
+          <w:lang w:val="en-US"/>
+        </w:rPr>
+        <w:t>b) Compare a value with fix number</w:t>
+      </w:r>
+    </w:p>
+    <w:p>
+      <w:pPr>
+        <w:ind w:firstLine="720" w:firstLineChars="0"/>
+        <w:rPr>
+          <w:rFonts w:hint="default" w:ascii="Consolas" w:hAnsi="Consolas" w:eastAsia="Consolas"/>
+          <w:b/>
+          <w:bCs w:val="0"/>
+          <w:color w:val="000000"/>
+          <w:sz w:val="22"/>
+          <w:szCs w:val="24"/>
+          <w:lang w:val="en-US"/>
+        </w:rPr>
+      </w:pPr>
+      <w:r>
+        <w:rPr>
+          <w:rFonts w:hint="default" w:ascii="Consolas" w:hAnsi="Consolas" w:eastAsia="Consolas"/>
+          <w:b/>
+          <w:bCs w:val="0"/>
+          <w:color w:val="000000"/>
+          <w:sz w:val="22"/>
+          <w:szCs w:val="24"/>
+          <w:lang w:val="en-US"/>
+        </w:rPr>
+        <w:t>C) Add two numbers (simple addition)</w:t>
+      </w:r>
+    </w:p>
+    <w:p>
+      <w:pPr>
+        <w:ind w:firstLine="720" w:firstLineChars="0"/>
+        <w:rPr>
+          <w:rFonts w:hint="default" w:ascii="Consolas" w:hAnsi="Consolas" w:eastAsia="Consolas"/>
+          <w:b/>
+          <w:bCs w:val="0"/>
+          <w:color w:val="000000"/>
+          <w:sz w:val="22"/>
+          <w:szCs w:val="24"/>
+          <w:lang w:val="en-US"/>
+        </w:rPr>
+      </w:pPr>
+      <w:r>
+        <w:rPr>
+          <w:rFonts w:hint="default" w:ascii="Consolas" w:hAnsi="Consolas" w:eastAsia="Consolas"/>
+          <w:b/>
+          <w:bCs w:val="0"/>
+          <w:color w:val="000000"/>
+          <w:sz w:val="22"/>
+          <w:szCs w:val="24"/>
+          <w:lang w:val="en-US"/>
+        </w:rPr>
+        <w:t>D) Multiply of two numbers 8 bit</w:t>
+      </w:r>
+    </w:p>
+    <w:p>
+      <w:pPr>
+        <w:ind w:firstLine="720" w:firstLineChars="0"/>
+        <w:rPr>
+          <w:rFonts w:hint="default" w:ascii="Consolas" w:hAnsi="Consolas" w:eastAsia="Consolas"/>
+          <w:b/>
+          <w:bCs w:val="0"/>
+          <w:color w:val="000000"/>
+          <w:sz w:val="22"/>
+          <w:szCs w:val="24"/>
+          <w:lang w:val="en-US"/>
+        </w:rPr>
+      </w:pPr>
+      <w:r>
+        <w:rPr>
+          <w:rFonts w:hint="default" w:ascii="Consolas" w:hAnsi="Consolas" w:eastAsia="Consolas"/>
+          <w:b/>
+          <w:bCs w:val="0"/>
+          <w:color w:val="000000"/>
+          <w:sz w:val="22"/>
+          <w:szCs w:val="24"/>
+          <w:lang w:val="en-US"/>
+        </w:rPr>
+        <w:t>E) 2’s complment of BCD number</w:t>
+      </w:r>
+    </w:p>
+    <w:p>
+      <w:pPr>
+        <w:ind w:firstLine="720" w:firstLineChars="0"/>
+        <w:rPr>
+          <w:rFonts w:hint="default" w:ascii="Consolas" w:hAnsi="Consolas" w:eastAsia="Consolas"/>
+          <w:b/>
+          <w:bCs w:val="0"/>
+          <w:color w:val="000000"/>
+          <w:sz w:val="22"/>
+          <w:szCs w:val="24"/>
+          <w:lang w:val="en-US"/>
+        </w:rPr>
+      </w:pPr>
+      <w:r>
+        <w:rPr>
+          <w:rFonts w:hint="default" w:ascii="Consolas" w:hAnsi="Consolas" w:eastAsia="Consolas"/>
+          <w:b/>
+          <w:bCs w:val="0"/>
+          <w:color w:val="000000"/>
+          <w:sz w:val="22"/>
+          <w:szCs w:val="24"/>
+          <w:lang w:val="en-US"/>
+        </w:rPr>
+        <w:t>F) Square of a number</w:t>
+      </w:r>
+    </w:p>
+    <w:p>
+      <w:pPr>
+        <w:ind w:firstLine="720" w:firstLineChars="0"/>
+        <w:rPr>
+          <w:rFonts w:hint="default" w:ascii="Consolas" w:hAnsi="Consolas" w:eastAsia="Consolas"/>
+          <w:b/>
+          <w:bCs w:val="0"/>
+          <w:color w:val="000000"/>
+          <w:sz w:val="22"/>
+          <w:szCs w:val="24"/>
+          <w:lang w:val="en-US"/>
+        </w:rPr>
+      </w:pPr>
+      <w:r>
+        <w:rPr>
+          <w:rFonts w:hint="default" w:ascii="Consolas" w:hAnsi="Consolas" w:eastAsia="Consolas"/>
+          <w:b/>
+          <w:bCs w:val="0"/>
+          <w:color w:val="000000"/>
+          <w:sz w:val="22"/>
+          <w:szCs w:val="24"/>
+          <w:lang w:val="en-US"/>
+        </w:rPr>
+        <w:t>G</w:t>
+      </w:r>
+    </w:p>
+    <w:p>
+      <w:pPr>
+        <w:rPr>
+          <w:rFonts w:hint="default" w:ascii="Consolas" w:hAnsi="Consolas" w:eastAsia="Consolas"/>
+          <w:b w:val="0"/>
+          <w:bCs/>
+          <w:color w:val="000000"/>
+          <w:sz w:val="22"/>
+          <w:szCs w:val="24"/>
+          <w:lang w:val="en-US"/>
+        </w:rPr>
+      </w:pPr>
+      <w:r>
+        <w:rPr>
+          <w:rFonts w:hint="default" w:ascii="Consolas" w:hAnsi="Consolas" w:eastAsia="Consolas"/>
+          <w:b w:val="0"/>
+          <w:bCs/>
+          <w:color w:val="000000"/>
+          <w:sz w:val="22"/>
+          <w:szCs w:val="24"/>
+          <w:lang w:val="en-US"/>
+        </w:rPr>
+        <w:t>8259 inturrept controller - block and pin diagrams and specific pin description, types of inturrepts</w:t>
+      </w:r>
+    </w:p>
+    <w:p>
+      <w:pPr>
+        <w:rPr>
+          <w:rFonts w:hint="default" w:ascii="Consolas" w:hAnsi="Consolas" w:eastAsia="Consolas"/>
+          <w:b w:val="0"/>
+          <w:bCs/>
+          <w:color w:val="000000"/>
+          <w:sz w:val="22"/>
+          <w:szCs w:val="24"/>
+          <w:lang w:val="en-US"/>
+        </w:rPr>
+      </w:pPr>
+    </w:p>
+    <w:p>
+      <w:pPr>
+        <w:rPr>
+          <w:rFonts w:hint="default" w:ascii="Consolas" w:hAnsi="Consolas" w:eastAsia="Consolas"/>
+          <w:b w:val="0"/>
+          <w:bCs/>
+          <w:color w:val="000000"/>
+          <w:sz w:val="22"/>
+          <w:szCs w:val="24"/>
+          <w:lang w:val="en-US"/>
+        </w:rPr>
+      </w:pPr>
+      <w:r>
+        <w:rPr>
+          <w:rFonts w:hint="default" w:ascii="Consolas" w:hAnsi="Consolas" w:eastAsia="Consolas"/>
+          <w:b/>
+          <w:bCs w:val="0"/>
+          <w:color w:val="000000"/>
+          <w:sz w:val="22"/>
+          <w:szCs w:val="24"/>
+          <w:lang w:val="en-US"/>
+        </w:rPr>
+        <w:t xml:space="preserve">Unit 4 8279 Block and pin diagram and specific pin description , microprocessor interfacing, </w:t>
+      </w:r>
+      <w:r>
+        <w:rPr>
+          <w:rFonts w:hint="default" w:ascii="Consolas" w:hAnsi="Consolas" w:eastAsia="Consolas"/>
+          <w:b w:val="0"/>
+          <w:bCs/>
+          <w:color w:val="000000"/>
+          <w:sz w:val="22"/>
+          <w:szCs w:val="24"/>
+          <w:lang w:val="en-US"/>
+        </w:rPr>
+        <w:t>8255 PPI , basic pins of 8254 and 8279</w:t>
+      </w:r>
+    </w:p>
+    <w:p>
+      <w:pPr>
+        <w:rPr>
+          <w:rFonts w:hint="default" w:ascii="Consolas" w:hAnsi="Consolas" w:eastAsia="Consolas"/>
+          <w:b w:val="0"/>
+          <w:bCs/>
+          <w:color w:val="000000"/>
+          <w:sz w:val="22"/>
+          <w:szCs w:val="24"/>
+          <w:lang w:val="en-US"/>
+        </w:rPr>
+      </w:pPr>
+    </w:p>
+    <w:p>
+      <w:pPr>
+        <w:rPr>
+          <w:rFonts w:hint="default" w:ascii="Consolas" w:hAnsi="Consolas" w:eastAsia="Consolas"/>
+          <w:b/>
+          <w:bCs w:val="0"/>
+          <w:color w:val="000000"/>
+          <w:sz w:val="22"/>
+          <w:szCs w:val="24"/>
+          <w:lang w:val="en-US"/>
+        </w:rPr>
+      </w:pPr>
+      <w:r>
+        <w:rPr>
+          <w:rFonts w:hint="default" w:ascii="Consolas" w:hAnsi="Consolas" w:eastAsia="Consolas"/>
+          <w:b/>
+          <w:bCs w:val="0"/>
+          <w:color w:val="000000"/>
+          <w:sz w:val="22"/>
+          <w:szCs w:val="24"/>
+          <w:lang w:val="en-US"/>
+        </w:rPr>
+        <w:t xml:space="preserve">Unit 5 LCD and multiplexed display, USART 8251 Diagram , RS232C &amp; RS422A,  IEEE 488 </w:t>
+      </w:r>
+    </w:p>
+    <w:p>
+      <w:pPr>
+        <w:rPr>
+          <w:rFonts w:hint="default" w:ascii="Consolas" w:hAnsi="Consolas" w:eastAsia="Consolas"/>
+          <w:b/>
+          <w:bCs w:val="0"/>
+          <w:color w:val="000000"/>
+          <w:sz w:val="22"/>
+          <w:szCs w:val="24"/>
+          <w:lang w:val="en-US"/>
+        </w:rPr>
+      </w:pPr>
+    </w:p>
+    <w:p>
+      <w:pPr>
+        <w:rPr>
+          <w:rFonts w:hint="default" w:ascii="Consolas" w:hAnsi="Consolas" w:eastAsia="Consolas"/>
+          <w:b/>
+          <w:bCs w:val="0"/>
+          <w:color w:val="000000"/>
+          <w:sz w:val="22"/>
+          <w:szCs w:val="24"/>
+          <w:lang w:val="en-US"/>
+        </w:rPr>
+      </w:pPr>
+    </w:p>
+    <w:p>
+      <w:pPr>
+        <w:rPr>
+          <w:rFonts w:hint="default" w:ascii="Consolas" w:hAnsi="Consolas" w:eastAsia="Consolas"/>
+          <w:b/>
+          <w:bCs w:val="0"/>
+          <w:color w:val="000000"/>
+          <w:sz w:val="22"/>
+          <w:szCs w:val="24"/>
+          <w:lang w:val="en-US"/>
+        </w:rPr>
+      </w:pPr>
+    </w:p>
+    <w:p>
+      <w:pPr>
+        <w:rPr>
+          <w:rFonts w:hint="default" w:ascii="Consolas" w:hAnsi="Consolas" w:eastAsia="Consolas"/>
+          <w:b/>
+          <w:bCs w:val="0"/>
+          <w:color w:val="000000"/>
+          <w:sz w:val="22"/>
+          <w:szCs w:val="24"/>
+          <w:lang w:val="en-US"/>
+        </w:rPr>
+      </w:pPr>
+    </w:p>
+    <w:p>
+      <w:pPr>
+        <w:rPr>
+          <w:rFonts w:hint="default" w:ascii="Consolas" w:hAnsi="Consolas" w:eastAsia="Consolas"/>
+          <w:b/>
+          <w:bCs w:val="0"/>
+          <w:color w:val="000000"/>
+          <w:sz w:val="22"/>
+          <w:szCs w:val="24"/>
+          <w:lang w:val="en-US"/>
+        </w:rPr>
+      </w:pPr>
+    </w:p>
+    <w:p>
+      <w:pPr>
+        <w:spacing w:beforeLines="0" w:afterLines="0"/>
+        <w:jc w:val="left"/>
+        <w:rPr>
+          <w:rFonts w:hint="default" w:ascii="Consolas" w:hAnsi="Consolas" w:eastAsia="Consolas"/>
+          <w:b/>
+          <w:bCs w:val="0"/>
+          <w:color w:val="000000"/>
+          <w:sz w:val="44"/>
+          <w:szCs w:val="48"/>
+          <w:u w:val="single"/>
+        </w:rPr>
+      </w:pPr>
+      <w:r>
+        <w:rPr>
+          <w:rFonts w:hint="default" w:ascii="Consolas" w:hAnsi="Consolas" w:eastAsia="Consolas"/>
+          <w:b/>
+          <w:bCs w:val="0"/>
+          <w:color w:val="000000"/>
+          <w:sz w:val="44"/>
+          <w:szCs w:val="48"/>
+          <w:u w:val="single"/>
+        </w:rPr>
+        <w:t>D</w:t>
+      </w:r>
+      <w:r>
+        <w:rPr>
+          <w:rFonts w:hint="default" w:ascii="Consolas" w:hAnsi="Consolas" w:eastAsia="Consolas"/>
+          <w:b/>
+          <w:bCs w:val="0"/>
+          <w:color w:val="000000"/>
+          <w:sz w:val="44"/>
+          <w:szCs w:val="48"/>
+          <w:u w:val="single"/>
+          <w:lang w:val="en-US"/>
+        </w:rPr>
+        <w:t>B</w:t>
+      </w:r>
+      <w:r>
+        <w:rPr>
+          <w:rFonts w:hint="default" w:ascii="Consolas" w:hAnsi="Consolas" w:eastAsia="Consolas"/>
+          <w:b/>
+          <w:bCs w:val="0"/>
+          <w:color w:val="000000"/>
+          <w:sz w:val="44"/>
+          <w:szCs w:val="48"/>
+          <w:u w:val="single"/>
+        </w:rPr>
+        <w:t>MS</w:t>
+      </w:r>
+      <w:r>
+        <w:rPr>
+          <w:rFonts w:hint="default" w:ascii="Consolas" w:hAnsi="Consolas" w:eastAsia="Consolas"/>
+          <w:b/>
+          <w:bCs w:val="0"/>
+          <w:color w:val="000000"/>
+          <w:sz w:val="44"/>
+          <w:szCs w:val="48"/>
+          <w:u w:val="none"/>
+        </w:rPr>
+        <w:t>:-</w:t>
+      </w:r>
       <w:bookmarkStart w:id="0" w:name="_GoBack"/>
       <w:bookmarkEnd w:id="0"/>
     </w:p>
@@ -1416,294 +1963,137 @@
       <w:pPr>
         <w:rPr>
           <w:rFonts w:hint="default" w:ascii="Consolas" w:hAnsi="Consolas" w:eastAsia="Consolas"/>
-          <w:b/>
-          <w:bCs w:val="0"/>
-          <w:color w:val="000000"/>
-          <w:sz w:val="22"/>
-          <w:szCs w:val="24"/>
-          <w:lang w:val="en-US"/>
-        </w:rPr>
-      </w:pPr>
-      <w:r>
-        <w:rPr>
-          <w:rFonts w:hint="default" w:ascii="Consolas" w:hAnsi="Consolas" w:eastAsia="Consolas"/>
-          <w:b/>
-          <w:bCs w:val="0"/>
-          <w:color w:val="000000"/>
-          <w:sz w:val="22"/>
-          <w:szCs w:val="24"/>
-          <w:lang w:val="en-US"/>
-        </w:rPr>
-        <w:t xml:space="preserve">Unit 2 Addresing mode, Instructions based on size, Timing diagram </w:t>
-      </w:r>
+          <w:color w:val="000000"/>
+          <w:sz w:val="22"/>
+          <w:szCs w:val="24"/>
+          <w:lang w:val="en-US"/>
+        </w:rPr>
+      </w:pPr>
+      <w:r>
+        <w:rPr>
+          <w:rFonts w:hint="default" w:ascii="Consolas" w:hAnsi="Consolas" w:eastAsia="Consolas"/>
+          <w:b/>
+          <w:color w:val="000000"/>
+          <w:sz w:val="22"/>
+          <w:szCs w:val="24"/>
+        </w:rPr>
+        <w:t>unit 1</w:t>
+      </w:r>
+      <w:r>
+        <w:rPr>
+          <w:rFonts w:hint="default" w:ascii="Consolas" w:hAnsi="Consolas" w:eastAsia="Consolas"/>
+          <w:color w:val="000000"/>
+          <w:sz w:val="22"/>
+          <w:szCs w:val="24"/>
+        </w:rPr>
+        <w:t xml:space="preserve"> </w:t>
+      </w:r>
+      <w:r>
+        <w:rPr>
+          <w:rFonts w:hint="default" w:ascii="Consolas" w:hAnsi="Consolas" w:eastAsia="Consolas"/>
+          <w:color w:val="000000"/>
+          <w:sz w:val="22"/>
+          <w:szCs w:val="24"/>
+          <w:lang w:val="en-US"/>
+        </w:rPr>
+        <w:t>File system v/s Database , advantages of DB, Attributes and Entity, strong v/s Weak entity, key constraints, relationship, generalization and Aggregation</w:t>
+      </w:r>
+    </w:p>
+    <w:p>
+      <w:pPr>
+        <w:rPr>
+          <w:rFonts w:hint="default" w:ascii="Consolas" w:hAnsi="Consolas" w:eastAsia="Consolas"/>
+          <w:color w:val="000000"/>
+          <w:sz w:val="22"/>
+          <w:szCs w:val="24"/>
+          <w:lang w:val="en-US"/>
+        </w:rPr>
+      </w:pPr>
     </w:p>
     <w:p>
       <w:pPr>
         <w:rPr>
           <w:rFonts w:hint="default" w:ascii="Consolas" w:hAnsi="Consolas" w:eastAsia="Consolas"/>
           <w:b w:val="0"/>
-          <w:bCs/>
-          <w:color w:val="000000"/>
-          <w:sz w:val="22"/>
-          <w:szCs w:val="24"/>
-          <w:lang w:val="en-US"/>
-        </w:rPr>
-      </w:pPr>
+          <w:bCs w:val="0"/>
+          <w:color w:val="000000"/>
+          <w:sz w:val="22"/>
+          <w:szCs w:val="24"/>
+          <w:lang w:val="en-US"/>
+        </w:rPr>
+      </w:pPr>
+      <w:r>
+        <w:rPr>
+          <w:rFonts w:hint="default" w:ascii="Consolas" w:hAnsi="Consolas" w:eastAsia="Consolas"/>
+          <w:b/>
+          <w:bCs/>
+          <w:color w:val="000000"/>
+          <w:sz w:val="22"/>
+          <w:szCs w:val="24"/>
+          <w:lang w:val="en-US"/>
+        </w:rPr>
+        <w:t xml:space="preserve">Unit 2 queries based on </w:t>
+      </w:r>
       <w:r>
         <w:rPr>
           <w:rFonts w:hint="default" w:ascii="Consolas" w:hAnsi="Consolas" w:eastAsia="Consolas"/>
           <w:b w:val="0"/>
-          <w:bCs/>
-          <w:color w:val="000000"/>
-          <w:sz w:val="22"/>
-          <w:szCs w:val="24"/>
-          <w:lang w:val="en-US"/>
-        </w:rPr>
-        <w:t>Machine cycle and instruction cycle, time delay</w:t>
-      </w:r>
-    </w:p>
-    <w:p>
-      <w:pPr>
+          <w:bCs w:val="0"/>
+          <w:color w:val="000000"/>
+          <w:sz w:val="22"/>
+          <w:szCs w:val="24"/>
+          <w:lang w:val="en-US"/>
+        </w:rPr>
+        <w:t xml:space="preserve">Selection, projection , </w:t>
+      </w:r>
+      <w:r>
+        <w:rPr>
+          <w:rFonts w:hint="default" w:ascii="Consolas" w:hAnsi="Consolas" w:eastAsia="Consolas"/>
+          <w:b/>
+          <w:bCs/>
+          <w:color w:val="000000"/>
+          <w:sz w:val="22"/>
+          <w:szCs w:val="24"/>
+          <w:lang w:val="en-US"/>
+        </w:rPr>
+        <w:t xml:space="preserve">Join - inner and outer join, </w:t>
+      </w:r>
+      <w:r>
         <w:rPr>
           <w:rFonts w:hint="default" w:ascii="Consolas" w:hAnsi="Consolas" w:eastAsia="Consolas"/>
           <w:b w:val="0"/>
-          <w:bCs/>
-          <w:color w:val="000000"/>
-          <w:sz w:val="22"/>
-          <w:szCs w:val="24"/>
-          <w:lang w:val="en-US"/>
-        </w:rPr>
-      </w:pPr>
-      <w:r>
+          <w:bCs w:val="0"/>
+          <w:color w:val="000000"/>
+          <w:sz w:val="22"/>
+          <w:szCs w:val="24"/>
+          <w:lang w:val="en-US"/>
+        </w:rPr>
+        <w:t>intersection, UNION, Nested and correlated queries,</w:t>
+      </w:r>
+    </w:p>
+    <w:p>
+      <w:pPr>
         <w:rPr>
           <w:rFonts w:hint="default" w:ascii="Consolas" w:hAnsi="Consolas" w:eastAsia="Consolas"/>
           <w:b w:val="0"/>
-          <w:bCs/>
-          <w:color w:val="000000"/>
-          <w:sz w:val="22"/>
-          <w:szCs w:val="24"/>
-          <w:lang w:val="en-US"/>
-        </w:rPr>
-        <w:t>Imp instructions: STA , LDA , LDX, LXI, MOV, MVI, LHLD, ADI, DAD, JMP, CALL</w:t>
-      </w:r>
-    </w:p>
-    <w:p>
-      <w:pPr>
+          <w:bCs w:val="0"/>
+          <w:color w:val="000000"/>
+          <w:sz w:val="22"/>
+          <w:szCs w:val="24"/>
+          <w:lang w:val="en-US"/>
+        </w:rPr>
+      </w:pPr>
+      <w:r>
         <w:rPr>
           <w:rFonts w:hint="default" w:ascii="Consolas" w:hAnsi="Consolas" w:eastAsia="Consolas"/>
           <w:b w:val="0"/>
-          <w:bCs/>
-          <w:color w:val="000000"/>
-          <w:sz w:val="22"/>
-          <w:szCs w:val="24"/>
-          <w:lang w:val="en-US"/>
-        </w:rPr>
-      </w:pPr>
-    </w:p>
-    <w:p>
-      <w:pPr>
-        <w:rPr>
-          <w:rFonts w:hint="default" w:ascii="Consolas" w:hAnsi="Consolas" w:eastAsia="Consolas"/>
-          <w:b/>
-          <w:bCs w:val="0"/>
-          <w:color w:val="000000"/>
-          <w:sz w:val="22"/>
-          <w:szCs w:val="24"/>
-          <w:lang w:val="en-US"/>
-        </w:rPr>
-      </w:pPr>
-      <w:r>
-        <w:rPr>
-          <w:rFonts w:hint="default" w:ascii="Consolas" w:hAnsi="Consolas" w:eastAsia="Consolas"/>
-          <w:b/>
-          <w:bCs w:val="0"/>
-          <w:color w:val="000000"/>
-          <w:sz w:val="22"/>
-          <w:szCs w:val="24"/>
-          <w:lang w:val="en-US"/>
-        </w:rPr>
-        <w:t xml:space="preserve">Unit 3 Imp programs </w:t>
-      </w:r>
-      <w:r>
-        <w:rPr>
-          <w:rFonts w:hint="default" w:ascii="Consolas" w:hAnsi="Consolas" w:eastAsia="Consolas"/>
-          <w:b/>
-          <w:bCs w:val="0"/>
-          <w:color w:val="000000"/>
-          <w:sz w:val="22"/>
-          <w:szCs w:val="24"/>
-          <w:lang w:val="en-US"/>
-        </w:rPr>
-        <w:br w:type="textWrapping"/>
-      </w:r>
-      <w:r>
-        <w:rPr>
-          <w:rFonts w:hint="default" w:ascii="Consolas" w:hAnsi="Consolas" w:eastAsia="Consolas"/>
-          <w:b/>
-          <w:bCs w:val="0"/>
-          <w:color w:val="000000"/>
-          <w:sz w:val="22"/>
-          <w:szCs w:val="24"/>
-          <w:lang w:val="en-US"/>
-        </w:rPr>
-        <w:tab/>
-        <w:t>a) Addition of two number 8 bit data and store at 16 bit address</w:t>
-      </w:r>
-    </w:p>
-    <w:p>
-      <w:pPr>
-        <w:ind w:firstLine="720" w:firstLineChars="0"/>
-        <w:rPr>
-          <w:rFonts w:hint="default" w:ascii="Consolas" w:hAnsi="Consolas" w:eastAsia="Consolas"/>
-          <w:b/>
-          <w:bCs w:val="0"/>
-          <w:color w:val="000000"/>
-          <w:sz w:val="22"/>
-          <w:szCs w:val="24"/>
-          <w:lang w:val="en-US"/>
-        </w:rPr>
-      </w:pPr>
-      <w:r>
-        <w:rPr>
-          <w:rFonts w:hint="default" w:ascii="Consolas" w:hAnsi="Consolas" w:eastAsia="Consolas"/>
-          <w:b/>
-          <w:bCs w:val="0"/>
-          <w:color w:val="000000"/>
-          <w:sz w:val="22"/>
-          <w:szCs w:val="24"/>
-          <w:lang w:val="en-US"/>
-        </w:rPr>
-        <w:t>b) Compare a value with fix number</w:t>
-      </w:r>
-    </w:p>
-    <w:p>
-      <w:pPr>
-        <w:ind w:firstLine="720" w:firstLineChars="0"/>
-        <w:rPr>
-          <w:rFonts w:hint="default" w:ascii="Consolas" w:hAnsi="Consolas" w:eastAsia="Consolas"/>
-          <w:b/>
-          <w:bCs w:val="0"/>
-          <w:color w:val="000000"/>
-          <w:sz w:val="22"/>
-          <w:szCs w:val="24"/>
-          <w:lang w:val="en-US"/>
-        </w:rPr>
-      </w:pPr>
-      <w:r>
-        <w:rPr>
-          <w:rFonts w:hint="default" w:ascii="Consolas" w:hAnsi="Consolas" w:eastAsia="Consolas"/>
-          <w:b/>
-          <w:bCs w:val="0"/>
-          <w:color w:val="000000"/>
-          <w:sz w:val="22"/>
-          <w:szCs w:val="24"/>
-          <w:lang w:val="en-US"/>
-        </w:rPr>
-        <w:t>C) Add two numbers (simple addition)</w:t>
-      </w:r>
-    </w:p>
-    <w:p>
-      <w:pPr>
-        <w:ind w:firstLine="720" w:firstLineChars="0"/>
-        <w:rPr>
-          <w:rFonts w:hint="default" w:ascii="Consolas" w:hAnsi="Consolas" w:eastAsia="Consolas"/>
-          <w:b/>
-          <w:bCs w:val="0"/>
-          <w:color w:val="000000"/>
-          <w:sz w:val="22"/>
-          <w:szCs w:val="24"/>
-          <w:lang w:val="en-US"/>
-        </w:rPr>
-      </w:pPr>
-      <w:r>
-        <w:rPr>
-          <w:rFonts w:hint="default" w:ascii="Consolas" w:hAnsi="Consolas" w:eastAsia="Consolas"/>
-          <w:b/>
-          <w:bCs w:val="0"/>
-          <w:color w:val="000000"/>
-          <w:sz w:val="22"/>
-          <w:szCs w:val="24"/>
-          <w:lang w:val="en-US"/>
-        </w:rPr>
-        <w:t>D) Multiply of two numbers 8 bit</w:t>
-      </w:r>
-    </w:p>
-    <w:p>
-      <w:pPr>
-        <w:ind w:firstLine="720" w:firstLineChars="0"/>
-        <w:rPr>
-          <w:rFonts w:hint="default" w:ascii="Consolas" w:hAnsi="Consolas" w:eastAsia="Consolas"/>
-          <w:b/>
-          <w:bCs w:val="0"/>
-          <w:color w:val="000000"/>
-          <w:sz w:val="22"/>
-          <w:szCs w:val="24"/>
-          <w:lang w:val="en-US"/>
-        </w:rPr>
-      </w:pPr>
-      <w:r>
-        <w:rPr>
-          <w:rFonts w:hint="default" w:ascii="Consolas" w:hAnsi="Consolas" w:eastAsia="Consolas"/>
-          <w:b/>
-          <w:bCs w:val="0"/>
-          <w:color w:val="000000"/>
-          <w:sz w:val="22"/>
-          <w:szCs w:val="24"/>
-          <w:lang w:val="en-US"/>
-        </w:rPr>
-        <w:t>E) 2’s complment of BCD number</w:t>
-      </w:r>
-    </w:p>
-    <w:p>
-      <w:pPr>
-        <w:ind w:firstLine="720" w:firstLineChars="0"/>
-        <w:rPr>
-          <w:rFonts w:hint="default" w:ascii="Consolas" w:hAnsi="Consolas" w:eastAsia="Consolas"/>
-          <w:b/>
-          <w:bCs w:val="0"/>
-          <w:color w:val="000000"/>
-          <w:sz w:val="22"/>
-          <w:szCs w:val="24"/>
-          <w:lang w:val="en-US"/>
-        </w:rPr>
-      </w:pPr>
-      <w:r>
-        <w:rPr>
-          <w:rFonts w:hint="default" w:ascii="Consolas" w:hAnsi="Consolas" w:eastAsia="Consolas"/>
-          <w:b/>
-          <w:bCs w:val="0"/>
-          <w:color w:val="000000"/>
-          <w:sz w:val="22"/>
-          <w:szCs w:val="24"/>
-          <w:lang w:val="en-US"/>
-        </w:rPr>
-        <w:t>F) Square of a number</w:t>
-      </w:r>
-    </w:p>
-    <w:p>
-      <w:pPr>
-        <w:ind w:firstLine="720" w:firstLineChars="0"/>
-        <w:rPr>
-          <w:rFonts w:hint="default" w:ascii="Consolas" w:hAnsi="Consolas" w:eastAsia="Consolas"/>
-          <w:b/>
-          <w:bCs w:val="0"/>
-          <w:color w:val="000000"/>
-          <w:sz w:val="22"/>
-          <w:szCs w:val="24"/>
-          <w:lang w:val="en-US"/>
-        </w:rPr>
-      </w:pPr>
-      <w:r>
-        <w:rPr>
-          <w:rFonts w:hint="default" w:ascii="Consolas" w:hAnsi="Consolas" w:eastAsia="Consolas"/>
-          <w:b/>
-          <w:bCs w:val="0"/>
-          <w:color w:val="000000"/>
-          <w:sz w:val="22"/>
-          <w:szCs w:val="24"/>
-          <w:lang w:val="en-US"/>
-        </w:rPr>
-        <w:t>G</w:t>
+          <w:bCs w:val="0"/>
+          <w:color w:val="000000"/>
+          <w:sz w:val="22"/>
+          <w:szCs w:val="24"/>
+          <w:lang w:val="en-US"/>
+        </w:rPr>
+        <w:t>ODBC And JDBC , Triggers and active DB, dynamic and embedded DB</w:t>
       </w:r>
     </w:p>
     <w:p>
@@ -1711,112 +2101,162 @@
         <w:rPr>
           <w:rFonts w:hint="default" w:ascii="Consolas" w:hAnsi="Consolas" w:eastAsia="Consolas"/>
           <w:b w:val="0"/>
-          <w:bCs/>
-          <w:color w:val="000000"/>
-          <w:sz w:val="22"/>
-          <w:szCs w:val="24"/>
-          <w:lang w:val="en-US"/>
-        </w:rPr>
-      </w:pPr>
-      <w:r>
+          <w:bCs w:val="0"/>
+          <w:color w:val="000000"/>
+          <w:sz w:val="22"/>
+          <w:szCs w:val="24"/>
+          <w:lang w:val="en-US"/>
+        </w:rPr>
+      </w:pPr>
+    </w:p>
+    <w:p>
+      <w:pPr>
+        <w:rPr>
+          <w:rFonts w:hint="default" w:ascii="Consolas" w:hAnsi="Consolas" w:eastAsia="Consolas"/>
+          <w:b/>
+          <w:bCs/>
+          <w:color w:val="000000"/>
+          <w:sz w:val="22"/>
+          <w:szCs w:val="24"/>
+          <w:lang w:val="en-US"/>
+        </w:rPr>
+      </w:pPr>
+      <w:r>
+        <w:rPr>
+          <w:rFonts w:hint="default" w:ascii="Consolas" w:hAnsi="Consolas" w:eastAsia="Consolas"/>
+          <w:b/>
+          <w:bCs/>
+          <w:color w:val="000000"/>
+          <w:sz w:val="22"/>
+          <w:szCs w:val="24"/>
+          <w:lang w:val="en-US"/>
+        </w:rPr>
+        <w:t>Unit 3 normal form, 3NF and BCNF, definiton of Schema Refinement, funcitonal dependency and types</w:t>
+      </w:r>
+    </w:p>
+    <w:p>
+      <w:pPr>
+        <w:rPr>
+          <w:rFonts w:hint="default" w:ascii="Consolas" w:hAnsi="Consolas" w:eastAsia="Consolas"/>
+          <w:b/>
+          <w:bCs/>
+          <w:color w:val="000000"/>
+          <w:sz w:val="22"/>
+          <w:szCs w:val="24"/>
+          <w:lang w:val="en-US"/>
+        </w:rPr>
+      </w:pPr>
+    </w:p>
+    <w:p>
+      <w:pPr>
         <w:rPr>
           <w:rFonts w:hint="default" w:ascii="Consolas" w:hAnsi="Consolas" w:eastAsia="Consolas"/>
           <w:b w:val="0"/>
-          <w:bCs/>
-          <w:color w:val="000000"/>
-          <w:sz w:val="22"/>
-          <w:szCs w:val="24"/>
-          <w:lang w:val="en-US"/>
-        </w:rPr>
-        <w:t>8259 inturrept controller - block and pin diagrams and specific pin description, types of inturrepts</w:t>
-      </w:r>
-    </w:p>
-    <w:p>
-      <w:pPr>
+          <w:bCs w:val="0"/>
+          <w:color w:val="000000"/>
+          <w:sz w:val="22"/>
+          <w:szCs w:val="24"/>
+          <w:lang w:val="en-US"/>
+        </w:rPr>
+      </w:pPr>
+      <w:r>
+        <w:rPr>
+          <w:rFonts w:hint="default" w:ascii="Consolas" w:hAnsi="Consolas" w:eastAsia="Consolas"/>
+          <w:b/>
+          <w:bCs/>
+          <w:color w:val="000000"/>
+          <w:sz w:val="22"/>
+          <w:szCs w:val="24"/>
+          <w:lang w:val="en-US"/>
+        </w:rPr>
+        <w:t xml:space="preserve">Unit 4 Transaction and steps, </w:t>
+      </w:r>
+      <w:r>
         <w:rPr>
           <w:rFonts w:hint="default" w:ascii="Consolas" w:hAnsi="Consolas" w:eastAsia="Consolas"/>
           <w:b w:val="0"/>
-          <w:bCs/>
-          <w:color w:val="000000"/>
-          <w:sz w:val="22"/>
-          <w:szCs w:val="24"/>
-          <w:lang w:val="en-US"/>
-        </w:rPr>
-      </w:pPr>
+          <w:bCs w:val="0"/>
+          <w:color w:val="000000"/>
+          <w:sz w:val="22"/>
+          <w:szCs w:val="24"/>
+          <w:lang w:val="en-US"/>
+        </w:rPr>
+        <w:t xml:space="preserve">ACID properties, definition of scheduale, serializability - conflict and view, Cascading definiton, </w:t>
+      </w:r>
+    </w:p>
+    <w:p>
+      <w:pPr>
+        <w:rPr>
+          <w:rFonts w:hint="default" w:ascii="Consolas" w:hAnsi="Consolas" w:eastAsia="Consolas"/>
+          <w:b/>
+          <w:bCs/>
+          <w:color w:val="000000"/>
+          <w:sz w:val="22"/>
+          <w:szCs w:val="24"/>
+          <w:lang w:val="en-US"/>
+        </w:rPr>
+      </w:pPr>
+    </w:p>
+    <w:p>
+      <w:pPr>
+        <w:rPr>
+          <w:rFonts w:hint="default" w:ascii="Consolas" w:hAnsi="Consolas" w:eastAsia="Consolas"/>
+          <w:b/>
+          <w:bCs/>
+          <w:color w:val="000000"/>
+          <w:sz w:val="22"/>
+          <w:szCs w:val="24"/>
+          <w:lang w:val="en-US"/>
+        </w:rPr>
+      </w:pPr>
+      <w:r>
+        <w:rPr>
+          <w:rFonts w:hint="default" w:ascii="Consolas" w:hAnsi="Consolas" w:eastAsia="Consolas"/>
+          <w:b/>
+          <w:bCs/>
+          <w:color w:val="000000"/>
+          <w:sz w:val="22"/>
+          <w:szCs w:val="24"/>
+          <w:lang w:val="en-US"/>
+        </w:rPr>
+        <w:t>Unit 5 Shadow paging and log based recovery, deferred and immidiate log</w:t>
+      </w:r>
     </w:p>
     <w:p>
       <w:pPr>
         <w:rPr>
           <w:rFonts w:hint="default" w:ascii="Consolas" w:hAnsi="Consolas" w:eastAsia="Consolas"/>
           <w:b w:val="0"/>
-          <w:bCs/>
-          <w:color w:val="000000"/>
-          <w:sz w:val="22"/>
-          <w:szCs w:val="24"/>
-          <w:lang w:val="en-US"/>
-        </w:rPr>
-      </w:pPr>
-      <w:r>
-        <w:rPr>
-          <w:rFonts w:hint="default" w:ascii="Consolas" w:hAnsi="Consolas" w:eastAsia="Consolas"/>
-          <w:b/>
-          <w:bCs w:val="0"/>
-          <w:color w:val="000000"/>
-          <w:sz w:val="22"/>
-          <w:szCs w:val="24"/>
-          <w:lang w:val="en-US"/>
-        </w:rPr>
-        <w:t xml:space="preserve">Unit 4 8279 Block and pin diagram and specific pin description , microprocessor interfacing, </w:t>
+          <w:bCs w:val="0"/>
+          <w:color w:val="000000"/>
+          <w:sz w:val="22"/>
+          <w:szCs w:val="24"/>
+          <w:lang w:val="en-US"/>
+        </w:rPr>
+      </w:pPr>
+      <w:r>
+        <w:rPr>
+          <w:rFonts w:hint="default" w:ascii="Consolas" w:hAnsi="Consolas" w:eastAsia="Consolas"/>
+          <w:b/>
+          <w:bCs/>
+          <w:color w:val="000000"/>
+          <w:sz w:val="22"/>
+          <w:szCs w:val="24"/>
+          <w:lang w:val="en-US"/>
+        </w:rPr>
+        <w:t xml:space="preserve">Deadlock handling, dirty reading, </w:t>
       </w:r>
       <w:r>
         <w:rPr>
           <w:rFonts w:hint="default" w:ascii="Consolas" w:hAnsi="Consolas" w:eastAsia="Consolas"/>
           <w:b w:val="0"/>
-          <w:bCs/>
-          <w:color w:val="000000"/>
-          <w:sz w:val="22"/>
-          <w:szCs w:val="24"/>
-          <w:lang w:val="en-US"/>
-        </w:rPr>
-        <w:t>8255 PPI , basic pins of 8254 and 8279</w:t>
-      </w:r>
-    </w:p>
-    <w:p>
-      <w:pPr>
-        <w:rPr>
-          <w:rFonts w:hint="default" w:ascii="Consolas" w:hAnsi="Consolas" w:eastAsia="Consolas"/>
-          <w:b w:val="0"/>
-          <w:bCs/>
-          <w:color w:val="000000"/>
-          <w:sz w:val="22"/>
-          <w:szCs w:val="24"/>
-          <w:lang w:val="en-US"/>
-        </w:rPr>
-      </w:pPr>
-    </w:p>
-    <w:p>
-      <w:pPr>
-        <w:rPr>
-          <w:rFonts w:hint="default" w:ascii="Consolas" w:hAnsi="Consolas" w:eastAsia="Consolas"/>
-          <w:b/>
-          <w:bCs/>
-          <w:color w:val="000000"/>
-          <w:sz w:val="22"/>
-          <w:szCs w:val="24"/>
-          <w:lang w:val="en-US"/>
-        </w:rPr>
-      </w:pPr>
-      <w:r>
-        <w:rPr>
-          <w:rFonts w:hint="default" w:ascii="Consolas" w:hAnsi="Consolas" w:eastAsia="Consolas"/>
-          <w:b/>
-          <w:bCs w:val="0"/>
-          <w:color w:val="000000"/>
-          <w:sz w:val="22"/>
-          <w:szCs w:val="24"/>
-          <w:lang w:val="en-US"/>
-        </w:rPr>
-        <w:t xml:space="preserve">Unit 5 LCD and multiplexed display, USART 8251 Diagram , RS232C &amp; RS422A,  IEEE 488 </w:t>
+          <w:bCs w:val="0"/>
+          <w:color w:val="000000"/>
+          <w:sz w:val="22"/>
+          <w:szCs w:val="24"/>
+          <w:lang w:val="en-US"/>
+        </w:rPr>
+        <w:t>timestamp based protocol, abort , rollback and terminate, starvation problem</w:t>
       </w:r>
     </w:p>
     <w:sectPr>

</xml_diff>